<commit_message>
Add multilingual story compare view with globe icon and harden local Edit mode.
Ship compare shells, Turkic globe assets, story DOCX edits, and clear stuck Edit API port conflicts so Save works again in development.

Co-authored-by: Cursor <cursoragent@cursor.com>
</commit_message>
<xml_diff>
--- a/az/wisdom-stories/eat-less-and-stay-on-the-right-path.docx
+++ b/az/wisdom-stories/eat-less-and-stay-on-the-right-path.docx
@@ -10,179 +10,135 @@
         <w:rPr>
           <w:sz w:val="52"/>
         </w:rPr>
-        <w:t xml:space="preserve">Az </w:t>
+        <w:t>Az yeyən və düz gedən</w:t>
       </w:r>
       <w:proofErr w:type="spellStart"/>
       <w:r>
         <w:rPr>
           <w:sz w:val="52"/>
         </w:rPr>
-        <w:t>yeyən</w:t>
       </w:r>
       <w:r>
         <w:rPr>
           <w:sz w:val="52"/>
         </w:rPr>
-        <w:t>in</w:t>
       </w:r>
       <w:proofErr w:type="spellEnd"/>
       <w:r>
         <w:rPr>
           <w:sz w:val="52"/>
         </w:rPr>
-        <w:t xml:space="preserve"> </w:t>
       </w:r>
       <w:proofErr w:type="spellStart"/>
       <w:r>
         <w:rPr>
           <w:sz w:val="52"/>
         </w:rPr>
-        <w:t>həkimlə</w:t>
       </w:r>
       <w:proofErr w:type="spellEnd"/>
       <w:r>
         <w:rPr>
           <w:sz w:val="52"/>
         </w:rPr>
-        <w:t>,</w:t>
       </w:r>
       <w:r>
         <w:rPr>
           <w:sz w:val="52"/>
         </w:rPr>
-        <w:t xml:space="preserve"> </w:t>
       </w:r>
       <w:proofErr w:type="spellStart"/>
       <w:r>
         <w:rPr>
           <w:sz w:val="52"/>
         </w:rPr>
-        <w:t>düz</w:t>
       </w:r>
       <w:proofErr w:type="spellEnd"/>
       <w:r>
         <w:rPr>
           <w:sz w:val="52"/>
         </w:rPr>
-        <w:t xml:space="preserve"> </w:t>
       </w:r>
       <w:proofErr w:type="spellStart"/>
       <w:r>
         <w:rPr>
           <w:sz w:val="52"/>
         </w:rPr>
-        <w:t>gedən</w:t>
       </w:r>
       <w:r>
         <w:rPr>
           <w:sz w:val="52"/>
         </w:rPr>
-        <w:t>in</w:t>
       </w:r>
       <w:proofErr w:type="spellEnd"/>
       <w:r>
         <w:rPr>
           <w:sz w:val="52"/>
         </w:rPr>
-        <w:t xml:space="preserve"> </w:t>
       </w:r>
       <w:proofErr w:type="spellStart"/>
       <w:r>
         <w:rPr>
           <w:sz w:val="52"/>
         </w:rPr>
-        <w:t>hakimlə</w:t>
       </w:r>
       <w:proofErr w:type="spellEnd"/>
       <w:r>
         <w:rPr>
           <w:sz w:val="52"/>
         </w:rPr>
-        <w:t xml:space="preserve"> </w:t>
       </w:r>
       <w:proofErr w:type="spellStart"/>
       <w:r>
         <w:rPr>
           <w:sz w:val="52"/>
         </w:rPr>
-        <w:t>işi</w:t>
       </w:r>
       <w:proofErr w:type="spellEnd"/>
       <w:r>
         <w:rPr>
           <w:sz w:val="52"/>
         </w:rPr>
-        <w:t xml:space="preserve"> </w:t>
       </w:r>
       <w:proofErr w:type="spellStart"/>
       <w:r>
         <w:rPr>
           <w:sz w:val="52"/>
         </w:rPr>
-        <w:t>olmaz</w:t>
       </w:r>
       <w:proofErr w:type="spellEnd"/>
     </w:p>
     <w:p>
       <w:r>
-        <w:t xml:space="preserve">Az </w:t>
+        <w:t>Az yeyənin həkimlə, düz gedənin hakimlə işi olmaz.</w:t>
       </w:r>
       <w:proofErr w:type="spellStart"/>
-      <w:r>
-        <w:t>yeyənin</w:t>
-      </w:r>
+      <w:r/>
       <w:proofErr w:type="spellEnd"/>
-      <w:r>
-        <w:t xml:space="preserve"> </w:t>
-      </w:r>
+      <w:r/>
       <w:proofErr w:type="spellStart"/>
-      <w:r>
-        <w:t>həkimlə</w:t>
-      </w:r>
+      <w:r/>
       <w:proofErr w:type="spellEnd"/>
-      <w:r>
-        <w:t xml:space="preserve">, </w:t>
-      </w:r>
+      <w:r/>
       <w:proofErr w:type="spellStart"/>
-      <w:r>
-        <w:t>düz</w:t>
-      </w:r>
+      <w:r/>
       <w:proofErr w:type="spellEnd"/>
-      <w:r>
-        <w:t xml:space="preserve"> </w:t>
-      </w:r>
+      <w:r/>
       <w:proofErr w:type="spellStart"/>
-      <w:r>
-        <w:t>gedənin</w:t>
-      </w:r>
+      <w:r/>
       <w:proofErr w:type="spellEnd"/>
-      <w:r>
-        <w:t xml:space="preserve"> </w:t>
-      </w:r>
+      <w:r/>
       <w:proofErr w:type="spellStart"/>
-      <w:r>
-        <w:t>hakimlə</w:t>
-      </w:r>
+      <w:r/>
       <w:proofErr w:type="spellEnd"/>
-      <w:r>
-        <w:t xml:space="preserve"> </w:t>
-      </w:r>
+      <w:r/>
       <w:proofErr w:type="spellStart"/>
-      <w:r>
-        <w:t>işi</w:t>
-      </w:r>
+      <w:r/>
       <w:proofErr w:type="spellEnd"/>
-      <w:r>
-        <w:t xml:space="preserve"> </w:t>
-      </w:r>
+      <w:r/>
       <w:proofErr w:type="spellStart"/>
-      <w:r>
-        <w:t>olmaz</w:t>
-      </w:r>
+      <w:r/>
       <w:proofErr w:type="spellEnd"/>
-      <w:r>
-        <w:t>.</w:t>
-      </w:r>
+      <w:r/>
     </w:p>
     <w:p>
       <w:pPr>
@@ -194,256 +150,132 @@
         <w:ind w:left="360" w:hanging="270"/>
       </w:pPr>
       <w:r>
-        <w:t xml:space="preserve">“Az </w:t>
+        <w:t>“Az yeyənin həkimlə işi olmaz” — insan yeməkdə həddi aşmasa, ölçülü-biçili qidalansa, sağlamlığını qorumaq ehtimalı daha yüksək olar və həkimə daha az ehtiyac duyar. Buradakı “az yemək” sözün hərfi mənasında ac qalmaq deyil, ifrat yeməmək, nəfsə hakim olmaq ölçülü qidalanmaq deməkdir.</w:t>
       </w:r>
       <w:proofErr w:type="spellStart"/>
-      <w:r>
-        <w:t>yeyənin</w:t>
-      </w:r>
+      <w:r/>
       <w:proofErr w:type="spellEnd"/>
-      <w:r>
-        <w:t xml:space="preserve"> </w:t>
-      </w:r>
+      <w:r/>
       <w:proofErr w:type="spellStart"/>
-      <w:r>
-        <w:t>həkimlə</w:t>
-      </w:r>
+      <w:r/>
       <w:proofErr w:type="spellEnd"/>
-      <w:r>
-        <w:t xml:space="preserve"> </w:t>
-      </w:r>
+      <w:r/>
       <w:proofErr w:type="spellStart"/>
-      <w:r>
-        <w:t>işi</w:t>
-      </w:r>
+      <w:r/>
       <w:proofErr w:type="spellEnd"/>
-      <w:r>
-        <w:t xml:space="preserve"> </w:t>
-      </w:r>
+      <w:r/>
       <w:proofErr w:type="spellStart"/>
-      <w:r>
-        <w:t>olmaz</w:t>
-      </w:r>
+      <w:r/>
       <w:proofErr w:type="spellEnd"/>
-      <w:r>
-        <w:t xml:space="preserve">” — </w:t>
-      </w:r>
+      <w:r/>
       <w:proofErr w:type="spellStart"/>
-      <w:r>
-        <w:t>insan</w:t>
-      </w:r>
+      <w:r/>
       <w:proofErr w:type="spellEnd"/>
-      <w:r>
-        <w:t xml:space="preserve"> </w:t>
-      </w:r>
+      <w:r/>
       <w:proofErr w:type="spellStart"/>
-      <w:r>
-        <w:t>yeməkdə</w:t>
-      </w:r>
+      <w:r/>
       <w:proofErr w:type="spellEnd"/>
-      <w:r>
-        <w:t xml:space="preserve"> </w:t>
-      </w:r>
+      <w:r/>
       <w:proofErr w:type="spellStart"/>
-      <w:r>
-        <w:t>həddi</w:t>
-      </w:r>
+      <w:r/>
       <w:proofErr w:type="spellEnd"/>
-      <w:r>
-        <w:t xml:space="preserve"> </w:t>
-      </w:r>
+      <w:r/>
       <w:proofErr w:type="spellStart"/>
-      <w:r>
-        <w:t>aşmasa</w:t>
-      </w:r>
+      <w:r/>
       <w:proofErr w:type="spellEnd"/>
-      <w:r>
-        <w:t xml:space="preserve">, </w:t>
-      </w:r>
+      <w:r/>
       <w:proofErr w:type="spellStart"/>
-      <w:r>
-        <w:t>ölçülü-biçili</w:t>
-      </w:r>
+      <w:r/>
       <w:proofErr w:type="spellEnd"/>
-      <w:r>
-        <w:t xml:space="preserve"> </w:t>
-      </w:r>
+      <w:r/>
       <w:proofErr w:type="spellStart"/>
-      <w:r>
-        <w:t>qidalansa</w:t>
-      </w:r>
+      <w:r/>
       <w:proofErr w:type="spellEnd"/>
-      <w:r>
-        <w:t xml:space="preserve">, </w:t>
-      </w:r>
+      <w:r/>
       <w:proofErr w:type="spellStart"/>
-      <w:r>
-        <w:t>sağlamlığını</w:t>
-      </w:r>
+      <w:r/>
       <w:proofErr w:type="spellEnd"/>
-      <w:r>
-        <w:t xml:space="preserve"> </w:t>
-      </w:r>
+      <w:r/>
       <w:proofErr w:type="spellStart"/>
-      <w:r>
-        <w:t>qorumaq</w:t>
-      </w:r>
+      <w:r/>
       <w:proofErr w:type="spellEnd"/>
-      <w:r>
-        <w:t xml:space="preserve"> </w:t>
-      </w:r>
+      <w:r/>
       <w:proofErr w:type="spellStart"/>
-      <w:r>
-        <w:t>ehtimalı</w:t>
-      </w:r>
+      <w:r/>
       <w:proofErr w:type="spellEnd"/>
-      <w:r>
-        <w:t xml:space="preserve"> daha </w:t>
-      </w:r>
+      <w:r/>
       <w:proofErr w:type="spellStart"/>
-      <w:r>
-        <w:t>yüksək</w:t>
-      </w:r>
+      <w:r/>
       <w:proofErr w:type="spellEnd"/>
-      <w:r>
-        <w:t xml:space="preserve"> olar və </w:t>
-      </w:r>
+      <w:r/>
       <w:proofErr w:type="spellStart"/>
-      <w:r>
-        <w:t>həkimə</w:t>
-      </w:r>
+      <w:r/>
       <w:proofErr w:type="spellEnd"/>
-      <w:r>
-        <w:t xml:space="preserve"> daha az </w:t>
-      </w:r>
+      <w:r/>
       <w:proofErr w:type="spellStart"/>
-      <w:r>
-        <w:t>ehtiyac</w:t>
-      </w:r>
+      <w:r/>
       <w:proofErr w:type="spellEnd"/>
-      <w:r>
-        <w:t xml:space="preserve"> </w:t>
-      </w:r>
+      <w:r/>
       <w:proofErr w:type="spellStart"/>
-      <w:r>
-        <w:t>duyar</w:t>
-      </w:r>
+      <w:r/>
       <w:proofErr w:type="spellEnd"/>
-      <w:r>
-        <w:t xml:space="preserve">. </w:t>
-      </w:r>
+      <w:r/>
       <w:proofErr w:type="spellStart"/>
-      <w:r>
-        <w:t>Buradakı</w:t>
-      </w:r>
+      <w:r/>
       <w:proofErr w:type="spellEnd"/>
-      <w:r>
-        <w:t xml:space="preserve"> “az </w:t>
-      </w:r>
+      <w:r/>
       <w:proofErr w:type="spellStart"/>
-      <w:r>
-        <w:t>yemək</w:t>
-      </w:r>
+      <w:r/>
       <w:proofErr w:type="spellEnd"/>
-      <w:r>
-        <w:t xml:space="preserve">” </w:t>
-      </w:r>
+      <w:r/>
       <w:proofErr w:type="spellStart"/>
-      <w:r>
-        <w:t>sözün</w:t>
-      </w:r>
+      <w:r/>
       <w:proofErr w:type="spellEnd"/>
-      <w:r>
-        <w:t xml:space="preserve"> </w:t>
-      </w:r>
+      <w:r/>
       <w:proofErr w:type="spellStart"/>
-      <w:r>
-        <w:t>hərfi</w:t>
-      </w:r>
+      <w:r/>
       <w:proofErr w:type="spellEnd"/>
-      <w:r>
-        <w:t xml:space="preserve"> </w:t>
-      </w:r>
+      <w:r/>
       <w:proofErr w:type="spellStart"/>
-      <w:r>
-        <w:t>mənasında</w:t>
-      </w:r>
+      <w:r/>
       <w:proofErr w:type="spellEnd"/>
-      <w:r>
-        <w:t xml:space="preserve"> ac </w:t>
-      </w:r>
+      <w:r/>
       <w:proofErr w:type="spellStart"/>
-      <w:r>
-        <w:t>qalmaq</w:t>
-      </w:r>
+      <w:r/>
       <w:proofErr w:type="spellEnd"/>
-      <w:r>
-        <w:t xml:space="preserve"> </w:t>
-      </w:r>
+      <w:r/>
       <w:proofErr w:type="spellStart"/>
-      <w:r>
-        <w:t>deyil</w:t>
-      </w:r>
+      <w:r/>
       <w:proofErr w:type="spellEnd"/>
-      <w:r>
-        <w:t xml:space="preserve">, </w:t>
-      </w:r>
+      <w:r/>
       <w:proofErr w:type="spellStart"/>
-      <w:r>
-        <w:t>ifrat</w:t>
-      </w:r>
+      <w:r/>
       <w:proofErr w:type="spellEnd"/>
-      <w:r>
-        <w:t xml:space="preserve"> </w:t>
-      </w:r>
+      <w:r/>
       <w:proofErr w:type="spellStart"/>
-      <w:r>
-        <w:t>yeməmək</w:t>
-      </w:r>
+      <w:r/>
       <w:proofErr w:type="spellEnd"/>
-      <w:r>
-        <w:t xml:space="preserve">, </w:t>
-      </w:r>
+      <w:r/>
       <w:proofErr w:type="spellStart"/>
-      <w:r>
-        <w:t>nəfsə</w:t>
-      </w:r>
+      <w:r/>
       <w:proofErr w:type="spellEnd"/>
-      <w:r>
-        <w:t xml:space="preserve"> hakim </w:t>
-      </w:r>
+      <w:r/>
       <w:proofErr w:type="spellStart"/>
-      <w:r>
-        <w:t>olmaq</w:t>
-      </w:r>
+      <w:r/>
       <w:proofErr w:type="spellEnd"/>
-      <w:r>
-        <w:t xml:space="preserve"> </w:t>
-      </w:r>
+      <w:r/>
       <w:proofErr w:type="spellStart"/>
-      <w:r>
-        <w:t>ölçülü</w:t>
-      </w:r>
+      <w:r/>
       <w:proofErr w:type="spellEnd"/>
-      <w:r>
-        <w:t xml:space="preserve"> </w:t>
-      </w:r>
+      <w:r/>
       <w:proofErr w:type="spellStart"/>
-      <w:r>
-        <w:t>qidalanmaq</w:t>
-      </w:r>
+      <w:r/>
       <w:proofErr w:type="spellEnd"/>
-      <w:r>
-        <w:t xml:space="preserve"> </w:t>
-      </w:r>
+      <w:r/>
       <w:proofErr w:type="spellStart"/>
-      <w:r>
-        <w:t>deməkdir.</w:t>
-      </w:r>
+      <w:r/>
       <w:proofErr w:type="spellEnd"/>
-      <w:r>
-        <w:t xml:space="preserve"> </w:t>
-      </w:r>
+      <w:r/>
     </w:p>
     <w:p>
       <w:pPr>
@@ -455,248 +287,128 @@
         <w:ind w:left="360" w:hanging="270"/>
       </w:pPr>
       <w:r>
-        <w:t>“</w:t>
+        <w:t>“Düz gedənin hakimlə işi olmaz” — insan dürüst, ədalətli və qanuna uyğun yaşayarsa, başqasının haqqına girməzsə, mübahisə və hüquqi problemlərlə daha az qarşılaşar. Buradakı “düz getmək” həm doğru yolla getmək, həm də vicdanlı və düzgün davranmaq mənasındadır.</w:t>
       </w:r>
       <w:proofErr w:type="spellStart"/>
-      <w:r>
-        <w:t>Düz</w:t>
-      </w:r>
+      <w:r/>
       <w:proofErr w:type="spellEnd"/>
-      <w:r>
-        <w:t xml:space="preserve"> </w:t>
-      </w:r>
+      <w:r/>
       <w:proofErr w:type="spellStart"/>
-      <w:r>
-        <w:t>gedənin</w:t>
-      </w:r>
+      <w:r/>
       <w:proofErr w:type="spellEnd"/>
-      <w:r>
-        <w:t xml:space="preserve"> </w:t>
-      </w:r>
+      <w:r/>
       <w:proofErr w:type="spellStart"/>
-      <w:r>
-        <w:t>hakimlə</w:t>
-      </w:r>
+      <w:r/>
       <w:proofErr w:type="spellEnd"/>
-      <w:r>
-        <w:t xml:space="preserve"> </w:t>
-      </w:r>
+      <w:r/>
       <w:proofErr w:type="spellStart"/>
-      <w:r>
-        <w:t>işi</w:t>
-      </w:r>
+      <w:r/>
       <w:proofErr w:type="spellEnd"/>
-      <w:r>
-        <w:t xml:space="preserve"> </w:t>
-      </w:r>
+      <w:r/>
       <w:proofErr w:type="spellStart"/>
-      <w:r>
-        <w:t>olmaz</w:t>
-      </w:r>
+      <w:r/>
       <w:proofErr w:type="spellEnd"/>
-      <w:r>
-        <w:t xml:space="preserve">” — </w:t>
-      </w:r>
+      <w:r/>
       <w:proofErr w:type="spellStart"/>
-      <w:r>
-        <w:t>insan</w:t>
-      </w:r>
+      <w:r/>
       <w:proofErr w:type="spellEnd"/>
-      <w:r>
-        <w:t xml:space="preserve"> </w:t>
-      </w:r>
+      <w:r/>
       <w:proofErr w:type="spellStart"/>
-      <w:r>
-        <w:t>dürüst</w:t>
-      </w:r>
+      <w:r/>
       <w:proofErr w:type="spellEnd"/>
-      <w:r>
-        <w:t xml:space="preserve">, </w:t>
-      </w:r>
+      <w:r/>
       <w:proofErr w:type="spellStart"/>
-      <w:r>
-        <w:t>ədalətli</w:t>
-      </w:r>
+      <w:r/>
       <w:proofErr w:type="spellEnd"/>
-      <w:r>
-        <w:t xml:space="preserve"> və </w:t>
-      </w:r>
+      <w:r/>
       <w:proofErr w:type="spellStart"/>
-      <w:r>
-        <w:t>qanuna</w:t>
-      </w:r>
+      <w:r/>
       <w:proofErr w:type="spellEnd"/>
-      <w:r>
-        <w:t xml:space="preserve"> </w:t>
-      </w:r>
+      <w:r/>
       <w:proofErr w:type="spellStart"/>
-      <w:r>
-        <w:t>uyğun</w:t>
-      </w:r>
+      <w:r/>
       <w:proofErr w:type="spellEnd"/>
-      <w:r>
-        <w:t xml:space="preserve"> </w:t>
-      </w:r>
+      <w:r/>
       <w:proofErr w:type="spellStart"/>
-      <w:r>
-        <w:t>yaşayarsa</w:t>
-      </w:r>
+      <w:r/>
       <w:proofErr w:type="spellEnd"/>
-      <w:r>
-        <w:t xml:space="preserve">, </w:t>
-      </w:r>
+      <w:r/>
       <w:proofErr w:type="spellStart"/>
-      <w:r>
-        <w:t>başqasının</w:t>
-      </w:r>
+      <w:r/>
       <w:proofErr w:type="spellEnd"/>
-      <w:r>
-        <w:t xml:space="preserve"> </w:t>
-      </w:r>
+      <w:r/>
       <w:proofErr w:type="spellStart"/>
-      <w:r>
-        <w:t>haqqına</w:t>
-      </w:r>
+      <w:r/>
       <w:proofErr w:type="spellEnd"/>
-      <w:r>
-        <w:t xml:space="preserve"> </w:t>
-      </w:r>
+      <w:r/>
       <w:proofErr w:type="spellStart"/>
-      <w:r>
-        <w:t>girməzsə</w:t>
-      </w:r>
+      <w:r/>
       <w:proofErr w:type="spellEnd"/>
-      <w:r>
-        <w:t xml:space="preserve">, </w:t>
-      </w:r>
+      <w:r/>
       <w:proofErr w:type="spellStart"/>
-      <w:r>
-        <w:t>mübahisə</w:t>
-      </w:r>
+      <w:r/>
       <w:proofErr w:type="spellEnd"/>
-      <w:r>
-        <w:t xml:space="preserve"> və </w:t>
-      </w:r>
+      <w:r/>
       <w:proofErr w:type="spellStart"/>
-      <w:r>
-        <w:t>hüquqi</w:t>
-      </w:r>
+      <w:r/>
       <w:proofErr w:type="spellEnd"/>
-      <w:r>
-        <w:t xml:space="preserve"> </w:t>
-      </w:r>
+      <w:r/>
       <w:proofErr w:type="spellStart"/>
-      <w:r>
-        <w:t>problemlərlə</w:t>
-      </w:r>
+      <w:r/>
       <w:proofErr w:type="spellEnd"/>
-      <w:r>
-        <w:t xml:space="preserve"> daha az </w:t>
-      </w:r>
+      <w:r/>
       <w:proofErr w:type="spellStart"/>
-      <w:r>
-        <w:t>qarşılaşar</w:t>
-      </w:r>
+      <w:r/>
       <w:proofErr w:type="spellEnd"/>
-      <w:r>
-        <w:t xml:space="preserve">. </w:t>
-      </w:r>
+      <w:r/>
       <w:proofErr w:type="spellStart"/>
-      <w:r>
-        <w:t>Buradakı</w:t>
-      </w:r>
+      <w:r/>
       <w:proofErr w:type="spellEnd"/>
-      <w:r>
-        <w:t xml:space="preserve"> “</w:t>
-      </w:r>
+      <w:r/>
       <w:proofErr w:type="spellStart"/>
-      <w:r>
-        <w:t>düz</w:t>
-      </w:r>
+      <w:r/>
       <w:proofErr w:type="spellEnd"/>
-      <w:r>
-        <w:t xml:space="preserve"> </w:t>
-      </w:r>
+      <w:r/>
       <w:proofErr w:type="spellStart"/>
-      <w:r>
-        <w:t>getmək</w:t>
-      </w:r>
+      <w:r/>
       <w:proofErr w:type="spellEnd"/>
-      <w:r>
-        <w:t xml:space="preserve">” </w:t>
-      </w:r>
+      <w:r/>
       <w:proofErr w:type="spellStart"/>
-      <w:r>
-        <w:t>həm</w:t>
-      </w:r>
+      <w:r/>
       <w:proofErr w:type="spellEnd"/>
-      <w:r>
-        <w:t xml:space="preserve"> </w:t>
-      </w:r>
+      <w:r/>
       <w:proofErr w:type="spellStart"/>
-      <w:r>
-        <w:t>doğru</w:t>
-      </w:r>
+      <w:r/>
       <w:proofErr w:type="spellEnd"/>
-      <w:r>
-        <w:t xml:space="preserve"> </w:t>
-      </w:r>
+      <w:r/>
       <w:proofErr w:type="spellStart"/>
-      <w:r>
-        <w:t>yolla</w:t>
-      </w:r>
+      <w:r/>
       <w:proofErr w:type="spellEnd"/>
-      <w:r>
-        <w:t xml:space="preserve"> </w:t>
-      </w:r>
+      <w:r/>
       <w:proofErr w:type="spellStart"/>
-      <w:r>
-        <w:t>getmək</w:t>
-      </w:r>
+      <w:r/>
       <w:proofErr w:type="spellEnd"/>
-      <w:r>
-        <w:t xml:space="preserve">, </w:t>
-      </w:r>
+      <w:r/>
       <w:proofErr w:type="spellStart"/>
-      <w:r>
-        <w:t>həm</w:t>
-      </w:r>
+      <w:r/>
       <w:proofErr w:type="spellEnd"/>
-      <w:r>
-        <w:t xml:space="preserve"> də </w:t>
-      </w:r>
+      <w:r/>
       <w:proofErr w:type="spellStart"/>
-      <w:r>
-        <w:t>vicdanlı</w:t>
-      </w:r>
+      <w:r/>
       <w:proofErr w:type="spellEnd"/>
-      <w:r>
-        <w:t xml:space="preserve"> və </w:t>
-      </w:r>
+      <w:r/>
       <w:proofErr w:type="spellStart"/>
-      <w:r>
-        <w:t>düzgün</w:t>
-      </w:r>
+      <w:r/>
       <w:proofErr w:type="spellEnd"/>
-      <w:r>
-        <w:t xml:space="preserve"> </w:t>
-      </w:r>
+      <w:r/>
       <w:proofErr w:type="spellStart"/>
-      <w:r>
-        <w:t>davranmaq</w:t>
-      </w:r>
+      <w:r/>
       <w:proofErr w:type="spellEnd"/>
-      <w:r>
-        <w:t xml:space="preserve"> </w:t>
-      </w:r>
+      <w:r/>
       <w:proofErr w:type="spellStart"/>
-      <w:r>
-        <w:t>mənasındadır</w:t>
-      </w:r>
+      <w:r/>
       <w:proofErr w:type="spellEnd"/>
-      <w:r>
-        <w:t>.</w:t>
-      </w:r>
+      <w:r/>
     </w:p>
     <w:p>
       <w:pPr>
@@ -721,7 +433,7 @@
           <w:i w:val="0"/>
           <w:color w:val="9A7417"/>
         </w:rPr>
-        <w:t>İbrət</w:t>
+        <w:t>İbrət: Yeməkdə ölçülü, davranışda düzgün ol — nə həkimə, nə də hakimə ehtiyacın olsun.</w:t>
       </w:r>
       <w:proofErr w:type="spellEnd"/>
       <w:r>
@@ -731,7 +443,6 @@
           <w:i w:val="0"/>
           <w:color w:val="9A7417"/>
         </w:rPr>
-        <w:t xml:space="preserve">: </w:t>
       </w:r>
       <w:proofErr w:type="spellStart"/>
       <w:r>
@@ -740,7 +451,6 @@
           <w:i w:val="0"/>
           <w:color w:val="3F3826"/>
         </w:rPr>
-        <w:t>Yeməkdə</w:t>
       </w:r>
       <w:proofErr w:type="spellEnd"/>
       <w:r>
@@ -749,7 +459,6 @@
           <w:i w:val="0"/>
           <w:color w:val="3F3826"/>
         </w:rPr>
-        <w:t xml:space="preserve"> </w:t>
       </w:r>
       <w:proofErr w:type="spellStart"/>
       <w:r>
@@ -758,7 +467,6 @@
           <w:i w:val="0"/>
           <w:color w:val="3F3826"/>
         </w:rPr>
-        <w:t>ölçülü</w:t>
       </w:r>
       <w:proofErr w:type="spellEnd"/>
       <w:r>
@@ -767,7 +475,6 @@
           <w:i w:val="0"/>
           <w:color w:val="3F3826"/>
         </w:rPr>
-        <w:t xml:space="preserve">, </w:t>
       </w:r>
       <w:proofErr w:type="spellStart"/>
       <w:r>
@@ -776,7 +483,6 @@
           <w:i w:val="0"/>
           <w:color w:val="3F3826"/>
         </w:rPr>
-        <w:t>davranışda</w:t>
       </w:r>
       <w:proofErr w:type="spellEnd"/>
       <w:r>
@@ -785,7 +491,6 @@
           <w:i w:val="0"/>
           <w:color w:val="3F3826"/>
         </w:rPr>
-        <w:t xml:space="preserve"> </w:t>
       </w:r>
       <w:proofErr w:type="spellStart"/>
       <w:r>
@@ -794,7 +499,6 @@
           <w:i w:val="0"/>
           <w:color w:val="3F3826"/>
         </w:rPr>
-        <w:t>düzgün</w:t>
       </w:r>
       <w:proofErr w:type="spellEnd"/>
       <w:r>
@@ -803,7 +507,6 @@
           <w:i w:val="0"/>
           <w:color w:val="3F3826"/>
         </w:rPr>
-        <w:t xml:space="preserve"> </w:t>
       </w:r>
       <w:proofErr w:type="spellStart"/>
       <w:r>
@@ -812,7 +515,6 @@
           <w:i w:val="0"/>
           <w:color w:val="3F3826"/>
         </w:rPr>
-        <w:t>ol</w:t>
       </w:r>
       <w:proofErr w:type="spellEnd"/>
       <w:r>
@@ -821,7 +523,6 @@
           <w:i w:val="0"/>
           <w:color w:val="3F3826"/>
         </w:rPr>
-        <w:t xml:space="preserve"> — nə </w:t>
       </w:r>
       <w:proofErr w:type="spellStart"/>
       <w:r>
@@ -830,7 +531,6 @@
           <w:i w:val="0"/>
           <w:color w:val="3F3826"/>
         </w:rPr>
-        <w:t>həkimə</w:t>
       </w:r>
       <w:proofErr w:type="spellEnd"/>
       <w:r>
@@ -839,7 +539,6 @@
           <w:i w:val="0"/>
           <w:color w:val="3F3826"/>
         </w:rPr>
-        <w:t xml:space="preserve">, nə də </w:t>
       </w:r>
       <w:proofErr w:type="spellStart"/>
       <w:r>
@@ -848,7 +547,6 @@
           <w:i w:val="0"/>
           <w:color w:val="3F3826"/>
         </w:rPr>
-        <w:t>hakimə</w:t>
       </w:r>
       <w:proofErr w:type="spellEnd"/>
       <w:r>
@@ -857,7 +555,6 @@
           <w:i w:val="0"/>
           <w:color w:val="3F3826"/>
         </w:rPr>
-        <w:t xml:space="preserve"> </w:t>
       </w:r>
       <w:proofErr w:type="spellStart"/>
       <w:r>
@@ -866,7 +563,6 @@
           <w:i w:val="0"/>
           <w:color w:val="3F3826"/>
         </w:rPr>
-        <w:t>ehtiyacın</w:t>
       </w:r>
       <w:proofErr w:type="spellEnd"/>
       <w:r>
@@ -875,7 +571,6 @@
           <w:i w:val="0"/>
           <w:color w:val="3F3826"/>
         </w:rPr>
-        <w:t xml:space="preserve"> </w:t>
       </w:r>
       <w:r>
         <w:rPr>
@@ -883,7 +578,6 @@
           <w:i w:val="0"/>
           <w:color w:val="3F3826"/>
         </w:rPr>
-        <w:t>olsun</w:t>
       </w:r>
       <w:r>
         <w:rPr>
@@ -891,7 +585,6 @@
           <w:i w:val="0"/>
           <w:color w:val="3F3826"/>
         </w:rPr>
-        <w:t>.</w:t>
       </w:r>
     </w:p>
     <w:p>

</xml_diff>